<commit_message>
Rediseno del programa: escalera de niveles, grilla semanal con hora local y nombres unicos
- lib/nivel1.ts: sistema unico de nombres (nombreCorto/cefr/subtitulo), paso en la escalera,
  prerrequisitos, alias "Nivel 1 - julio 2026", PROFES[], precioLabel(), PAISES + horaLocal()
- Componentes nuevos: Escalera (chips "cual es tu caso" + peldanos), HorarioSemanal
  (grilla Lun-Jue con selector de pais sincronizado), ResumenReserva (barra sticky),
  EquipoProfes; hook useHoraLocal con autodeteccion y localStorage
- Pagina de inscripcion: deep link ?clase=, stepper real, modo Ninos (datos apoderado/alumno),
  pago por pais (Chile / otro pais), persistencia en sessionStorage, FAQ puente Nivel 1
- Pagina programa y home (Courses derivado de datos, Hero con chips de entrada, Courses
  antes del video) usan los mismos componentes; footer con tildes; FAQ reordenada
- PDFs regenerados con la nueva nomenclatura

Co-Authored-By: Claude Opus 5 <noreply@anthropic.com>
</commit_message>
<xml_diff>
--- a/public/programas/Programa_Basico1_Octubre_2026.docx
+++ b/public/programas/Programa_Basico1_Octubre_2026.docx
@@ -79,7 +79,7 @@
           <w:sz w:val="48"/>
           <w:szCs w:val="48"/>
         </w:rPr>
-        <w:t xml:space="preserve">Básico 1</w:t>
+        <w:t xml:space="preserve">Básico 1 (A1.1)</w:t>
       </w:r>
     </w:p>
     <w:p>
@@ -126,7 +126,7 @@
           <w:sz w:val="23"/>
           <w:szCs w:val="23"/>
         </w:rPr>
-        <w:t xml:space="preserve">A1.1 · desde cero absoluto</w:t>
+        <w:t xml:space="preserve">Paso 1 de la escalera · desde cero</w:t>
       </w:r>
     </w:p>
     <w:p>
@@ -141,7 +141,7 @@
           <w:sz w:val="23"/>
           <w:szCs w:val="23"/>
         </w:rPr>
-        <w:t xml:space="preserve">Martes 20:00 hora Chile · Prof.ª Guiran (기란)</w:t>
+        <w:t xml:space="preserve">Martes 20:00 hora Chile · Guiran · 기란</w:t>
       </w:r>
     </w:p>
     <w:p>
@@ -156,7 +156,7 @@
           <w:sz w:val="23"/>
           <w:szCs w:val="23"/>
         </w:rPr>
-        <w:t xml:space="preserve">Jueves 20:00 hora Chile · Prof.ª Guiran (기란)</w:t>
+        <w:t xml:space="preserve">Jueves 20:00 hora Chile · Guiran · 기란</w:t>
       </w:r>
     </w:p>
     <w:p>
@@ -186,7 +186,7 @@
           <w:sz w:val="23"/>
           <w:szCs w:val="23"/>
         </w:rPr>
-        <w:t xml:space="preserve">US$150 pago único · o US$75/mes × 2</w:t>
+        <w:t xml:space="preserve">US$150 el curso completo · o 2 cuotas de US$75</w:t>
       </w:r>
     </w:p>
     <w:p>
@@ -420,7 +420,7 @@
                 <w:sz w:val="20"/>
                 <w:szCs w:val="20"/>
               </w:rPr>
-              <w:t xml:space="preserve">A1.1 · desde cero absoluto</w:t>
+              <w:t xml:space="preserve">A1.1 · desde cero · antes: Nivel 1 · julio 2026</w:t>
             </w:r>
           </w:p>
         </w:tc>
@@ -536,7 +536,7 @@
                 <w:sz w:val="20"/>
                 <w:szCs w:val="20"/>
               </w:rPr>
-              <w:t xml:space="preserve">Martes 20:00 (hora Chile) · Prof.ª Guiran (기란)  |  Jueves 20:00 (hora Chile) · Prof.ª Guiran (기란)</w:t>
+              <w:t xml:space="preserve">Martes 20:00 (hora Chile) · Guiran · 기란  |  Jueves 20:00 (hora Chile) · Guiran · 기란</w:t>
             </w:r>
           </w:p>
         </w:tc>
@@ -768,7 +768,7 @@
                 <w:sz w:val="20"/>
                 <w:szCs w:val="20"/>
               </w:rPr>
-              <w:t xml:space="preserve">US$150 pago único · o US$75/mes × 2</w:t>
+              <w:t xml:space="preserve">US$150 el curso completo · o 2 cuotas de US$75</w:t>
             </w:r>
           </w:p>
         </w:tc>
@@ -1023,7 +1023,7 @@
           <w:sz w:val="23"/>
           <w:szCs w:val="23"/>
         </w:rPr>
-        <w:t xml:space="preserve">Sección Martes 20:00 · Prof.ª Guiran (기란)</w:t>
+        <w:t xml:space="preserve">Sección Martes 20:00 · Guiran · 기란</w:t>
       </w:r>
     </w:p>
     <w:tbl>
@@ -2098,7 +2098,7 @@
           <w:sz w:val="23"/>
           <w:szCs w:val="23"/>
         </w:rPr>
-        <w:t xml:space="preserve">Sección Jueves 20:00 · Prof.ª Guiran (기란)</w:t>
+        <w:t xml:space="preserve">Sección Jueves 20:00 · Guiran · 기란</w:t>
       </w:r>
     </w:p>
     <w:tbl>
@@ -4217,7 +4217,7 @@
           <w:sz w:val="18"/>
           <w:szCs w:val="18"/>
         </w:rPr>
-        <w:t xml:space="preserve">España cambia de hora el 25 de octubre y EE.UU. el 1 de noviembre (la tabla muestra antes → después). Chile, Argentina, México, Colombia, Perú y Corea no cambian durante el curso.</w:t>
+        <w:t xml:space="preserve">España cambia de hora el 25 de octubre y EE.UU. el 1 de noviembre (se muestra antes → después). Chile, Argentina, México, Colombia, Perú y Corea no cambian durante el curso.</w:t>
       </w:r>
     </w:p>
     <w:p>
@@ -4263,7 +4263,7 @@
           <w:sz w:val="22"/>
           <w:szCs w:val="22"/>
         </w:rPr>
-        <w:t xml:space="preserve">Precio: US$150 pago único · o US$75/mes × 2. Mismo precio para todos los cursos de la academia.</w:t>
+        <w:t xml:space="preserve">Precio: US$150 el curso completo · o 2 cuotas de US$75. Mismo precio para todos los cursos de la academia.</w:t>
       </w:r>
     </w:p>
     <w:p>
@@ -4504,7 +4504,7 @@
         <w:sz w:val="16"/>
         <w:szCs w:val="16"/>
       </w:rPr>
-      <w:t xml:space="preserve">Academia Seúl · Programa Básico 1 · Octubre 2026</w:t>
+      <w:t xml:space="preserve">Academia Seúl · Programa Básico 1 (A1.1) · Octubre 2026</w:t>
     </w:r>
   </w:p>
 </w:hdr>

</xml_diff>